<commit_message>
Update doc with new Req
</commit_message>
<xml_diff>
--- a/Doc/Overview/WF_GDD_CH01_Executive_Summary_v1.0.docx
+++ b/Doc/Overview/WF_GDD_CH01_Executive_Summary_v1.0.docx
@@ -2512,187 +2512,7 @@
           <w:szCs w:val="24"/>
           <w:lang w:val="vi-VN" w:eastAsia="vi-VN"/>
         </w:rPr>
-        <w:t xml:space="preserve">Mỗi map là một vùng đất </w:t>
-      </w:r>
-      <w:proofErr w:type="spellStart"/>
-      <w:r>
-        <w:rPr>
-          <w:rFonts w:ascii="Times New Roman" w:hAnsi="Times New Roman" w:cs="Times New Roman"/>
-          <w:sz w:val="24"/>
-          <w:szCs w:val="24"/>
-          <w:lang w:val="vi-VN" w:eastAsia="vi-VN"/>
-        </w:rPr>
-        <w:t>handcrafted</w:t>
-      </w:r>
-      <w:proofErr w:type="spellEnd"/>
-      <w:r>
-        <w:rPr>
-          <w:rFonts w:ascii="Times New Roman" w:hAnsi="Times New Roman" w:cs="Times New Roman"/>
-          <w:sz w:val="24"/>
-          <w:szCs w:val="24"/>
-          <w:lang w:val="vi-VN" w:eastAsia="vi-VN"/>
-        </w:rPr>
-        <w:t xml:space="preserve"> có hệ sinh thái, tài nguyên, </w:t>
-      </w:r>
-      <w:proofErr w:type="spellStart"/>
-      <w:r>
-        <w:rPr>
-          <w:rFonts w:ascii="Times New Roman" w:hAnsi="Times New Roman" w:cs="Times New Roman"/>
-          <w:sz w:val="24"/>
-          <w:szCs w:val="24"/>
-          <w:lang w:val="vi-VN" w:eastAsia="vi-VN"/>
-        </w:rPr>
-        <w:t>Large</w:t>
-      </w:r>
-      <w:proofErr w:type="spellEnd"/>
-      <w:r>
-        <w:rPr>
-          <w:rFonts w:ascii="Times New Roman" w:hAnsi="Times New Roman" w:cs="Times New Roman"/>
-          <w:sz w:val="24"/>
-          <w:szCs w:val="24"/>
-          <w:lang w:val="vi-VN" w:eastAsia="vi-VN"/>
-        </w:rPr>
-        <w:t xml:space="preserve"> </w:t>
-      </w:r>
-      <w:proofErr w:type="spellStart"/>
-      <w:r>
-        <w:rPr>
-          <w:rFonts w:ascii="Times New Roman" w:hAnsi="Times New Roman" w:cs="Times New Roman"/>
-          <w:sz w:val="24"/>
-          <w:szCs w:val="24"/>
-          <w:lang w:val="vi-VN" w:eastAsia="vi-VN"/>
-        </w:rPr>
-        <w:t>Monsters</w:t>
-      </w:r>
-      <w:proofErr w:type="spellEnd"/>
-      <w:r>
-        <w:rPr>
-          <w:rFonts w:ascii="Times New Roman" w:hAnsi="Times New Roman" w:cs="Times New Roman"/>
-          <w:sz w:val="24"/>
-          <w:szCs w:val="24"/>
-          <w:lang w:val="vi-VN" w:eastAsia="vi-VN"/>
-        </w:rPr>
-        <w:t xml:space="preserve">, </w:t>
-      </w:r>
-      <w:proofErr w:type="spellStart"/>
-      <w:r>
-        <w:rPr>
-          <w:rFonts w:ascii="Times New Roman" w:hAnsi="Times New Roman" w:cs="Times New Roman"/>
-          <w:sz w:val="24"/>
-          <w:szCs w:val="24"/>
-          <w:lang w:val="vi-VN" w:eastAsia="vi-VN"/>
-        </w:rPr>
-        <w:t>Settlement</w:t>
-      </w:r>
-      <w:proofErr w:type="spellEnd"/>
-      <w:r>
-        <w:rPr>
-          <w:rFonts w:ascii="Times New Roman" w:hAnsi="Times New Roman" w:cs="Times New Roman"/>
-          <w:sz w:val="24"/>
-          <w:szCs w:val="24"/>
-          <w:lang w:val="vi-VN" w:eastAsia="vi-VN"/>
-        </w:rPr>
-        <w:t xml:space="preserve">, </w:t>
-      </w:r>
-      <w:proofErr w:type="spellStart"/>
-      <w:r>
-        <w:rPr>
-          <w:rFonts w:ascii="Times New Roman" w:hAnsi="Times New Roman" w:cs="Times New Roman"/>
-          <w:sz w:val="24"/>
-          <w:szCs w:val="24"/>
-          <w:lang w:val="vi-VN" w:eastAsia="vi-VN"/>
-        </w:rPr>
-        <w:t>Faction</w:t>
-      </w:r>
-      <w:proofErr w:type="spellEnd"/>
-      <w:r>
-        <w:rPr>
-          <w:rFonts w:ascii="Times New Roman" w:hAnsi="Times New Roman" w:cs="Times New Roman"/>
-          <w:sz w:val="24"/>
-          <w:szCs w:val="24"/>
-          <w:lang w:val="vi-VN" w:eastAsia="vi-VN"/>
-        </w:rPr>
-        <w:t xml:space="preserve"> </w:t>
-      </w:r>
-      <w:proofErr w:type="spellStart"/>
-      <w:r>
-        <w:rPr>
-          <w:rFonts w:ascii="Times New Roman" w:hAnsi="Times New Roman" w:cs="Times New Roman"/>
-          <w:sz w:val="24"/>
-          <w:szCs w:val="24"/>
-          <w:lang w:val="vi-VN" w:eastAsia="vi-VN"/>
-        </w:rPr>
-        <w:t>Presence</w:t>
-      </w:r>
-      <w:proofErr w:type="spellEnd"/>
-      <w:r>
-        <w:rPr>
-          <w:rFonts w:ascii="Times New Roman" w:hAnsi="Times New Roman" w:cs="Times New Roman"/>
-          <w:sz w:val="24"/>
-          <w:szCs w:val="24"/>
-          <w:lang w:val="vi-VN" w:eastAsia="vi-VN"/>
-        </w:rPr>
-        <w:t xml:space="preserve">, </w:t>
-      </w:r>
-      <w:proofErr w:type="spellStart"/>
-      <w:r>
-        <w:rPr>
-          <w:rFonts w:ascii="Times New Roman" w:hAnsi="Times New Roman" w:cs="Times New Roman"/>
-          <w:sz w:val="24"/>
-          <w:szCs w:val="24"/>
-          <w:lang w:val="vi-VN" w:eastAsia="vi-VN"/>
-        </w:rPr>
-        <w:t>Rift</w:t>
-      </w:r>
-      <w:proofErr w:type="spellEnd"/>
-      <w:r>
-        <w:rPr>
-          <w:rFonts w:ascii="Times New Roman" w:hAnsi="Times New Roman" w:cs="Times New Roman"/>
-          <w:sz w:val="24"/>
-          <w:szCs w:val="24"/>
-          <w:lang w:val="vi-VN" w:eastAsia="vi-VN"/>
-        </w:rPr>
-        <w:t xml:space="preserve"> </w:t>
-      </w:r>
-      <w:proofErr w:type="spellStart"/>
-      <w:r>
-        <w:rPr>
-          <w:rFonts w:ascii="Times New Roman" w:hAnsi="Times New Roman" w:cs="Times New Roman"/>
-          <w:sz w:val="24"/>
-          <w:szCs w:val="24"/>
-          <w:lang w:val="vi-VN" w:eastAsia="vi-VN"/>
-        </w:rPr>
-        <w:t>Activity</w:t>
-      </w:r>
-      <w:proofErr w:type="spellEnd"/>
-      <w:r>
-        <w:rPr>
-          <w:rFonts w:ascii="Times New Roman" w:hAnsi="Times New Roman" w:cs="Times New Roman"/>
-          <w:sz w:val="24"/>
-          <w:szCs w:val="24"/>
-          <w:lang w:val="vi-VN" w:eastAsia="vi-VN"/>
-        </w:rPr>
-        <w:t xml:space="preserve">, </w:t>
-      </w:r>
-      <w:proofErr w:type="spellStart"/>
-      <w:r>
-        <w:rPr>
-          <w:rFonts w:ascii="Times New Roman" w:hAnsi="Times New Roman" w:cs="Times New Roman"/>
-          <w:sz w:val="24"/>
-          <w:szCs w:val="24"/>
-          <w:lang w:val="vi-VN" w:eastAsia="vi-VN"/>
-        </w:rPr>
-        <w:t>Locations</w:t>
-      </w:r>
-      <w:proofErr w:type="spellEnd"/>
-      <w:r>
-        <w:rPr>
-          <w:rFonts w:ascii="Times New Roman" w:hAnsi="Times New Roman" w:cs="Times New Roman"/>
-          <w:sz w:val="24"/>
-          <w:szCs w:val="24"/>
-          <w:lang w:val="vi-VN" w:eastAsia="vi-VN"/>
-        </w:rPr>
-        <w:t xml:space="preserve"> và Dynamic Events riêng.</w:t>
+        <w:t>Phiên bản 1 (Version 1) sử dụng bản đồ thủ công (handcrafted map) để xác thực các hệ thống cốt lõi: Exploration, Gathering, Settlement, Day/Night, NPCs, Defense, Progression và World interaction. Mỗi map là một vùng đất handcrafted có hệ sinh thái, tài nguyên, Large Monsters, Settlement, Faction Presence, Rift Activity, Locations và Dynamic Events riêng; các phiên bản sau (Version 2) có thể giới thiệu procedural world generation.</w:t>
       </w:r>
     </w:p>
     <w:p>
@@ -3098,87 +2918,7 @@
           <w:szCs w:val="24"/>
           <w:lang w:val="vi-VN" w:eastAsia="vi-VN"/>
         </w:rPr>
-        <w:t xml:space="preserve">Chu kỳ Dawn → Day → </w:t>
-      </w:r>
-      <w:proofErr w:type="spellStart"/>
-      <w:r>
-        <w:rPr>
-          <w:rFonts w:ascii="Times New Roman" w:hAnsi="Times New Roman" w:cs="Times New Roman"/>
-          <w:sz w:val="24"/>
-          <w:szCs w:val="24"/>
-          <w:lang w:val="vi-VN" w:eastAsia="vi-VN"/>
-        </w:rPr>
-        <w:t>Dusk</w:t>
-      </w:r>
-      <w:proofErr w:type="spellEnd"/>
-      <w:r>
-        <w:rPr>
-          <w:rFonts w:ascii="Times New Roman" w:hAnsi="Times New Roman" w:cs="Times New Roman"/>
-          <w:sz w:val="24"/>
-          <w:szCs w:val="24"/>
-          <w:lang w:val="vi-VN" w:eastAsia="vi-VN"/>
-        </w:rPr>
-        <w:t xml:space="preserve"> → Night ảnh hưởng đến hoạt động sinh vật, </w:t>
-      </w:r>
-      <w:proofErr w:type="spellStart"/>
-      <w:r>
-        <w:rPr>
-          <w:rFonts w:ascii="Times New Roman" w:hAnsi="Times New Roman" w:cs="Times New Roman"/>
-          <w:sz w:val="24"/>
-          <w:szCs w:val="24"/>
-          <w:lang w:val="vi-VN" w:eastAsia="vi-VN"/>
-        </w:rPr>
-        <w:t>Ecosystem</w:t>
-      </w:r>
-      <w:proofErr w:type="spellEnd"/>
-      <w:r>
-        <w:rPr>
-          <w:rFonts w:ascii="Times New Roman" w:hAnsi="Times New Roman" w:cs="Times New Roman"/>
-          <w:sz w:val="24"/>
-          <w:szCs w:val="24"/>
-          <w:lang w:val="vi-VN" w:eastAsia="vi-VN"/>
-        </w:rPr>
-        <w:t xml:space="preserve">, </w:t>
-      </w:r>
-      <w:proofErr w:type="spellStart"/>
-      <w:r>
-        <w:rPr>
-          <w:rFonts w:ascii="Times New Roman" w:hAnsi="Times New Roman" w:cs="Times New Roman"/>
-          <w:sz w:val="24"/>
-          <w:szCs w:val="24"/>
-          <w:lang w:val="vi-VN" w:eastAsia="vi-VN"/>
-        </w:rPr>
-        <w:t>Rift</w:t>
-      </w:r>
-      <w:proofErr w:type="spellEnd"/>
-      <w:r>
-        <w:rPr>
-          <w:rFonts w:ascii="Times New Roman" w:hAnsi="Times New Roman" w:cs="Times New Roman"/>
-          <w:sz w:val="24"/>
-          <w:szCs w:val="24"/>
-          <w:lang w:val="vi-VN" w:eastAsia="vi-VN"/>
-        </w:rPr>
-        <w:t xml:space="preserve"> </w:t>
-      </w:r>
-      <w:proofErr w:type="spellStart"/>
-      <w:r>
-        <w:rPr>
-          <w:rFonts w:ascii="Times New Roman" w:hAnsi="Times New Roman" w:cs="Times New Roman"/>
-          <w:sz w:val="24"/>
-          <w:szCs w:val="24"/>
-          <w:lang w:val="vi-VN" w:eastAsia="vi-VN"/>
-        </w:rPr>
-        <w:t>Activity</w:t>
-      </w:r>
-      <w:proofErr w:type="spellEnd"/>
-      <w:r>
-        <w:rPr>
-          <w:rFonts w:ascii="Times New Roman" w:hAnsi="Times New Roman" w:cs="Times New Roman"/>
-          <w:sz w:val="24"/>
-          <w:szCs w:val="24"/>
-          <w:lang w:val="vi-VN" w:eastAsia="vi-VN"/>
-        </w:rPr>
-        <w:t>, tầm nhìn, Events và hành vi của các thế lực.</w:t>
+        <w:t>Chu kỳ Day/Night là một vòng lặp gameplay có ý nghĩa thực chất chứ không chỉ là hệ thống chiếu sáng hình ảnh. Ban ngày (Day) tập trung vào: khám phá (Exploration), thu thập tài nguyên (Gathering), săn bắn (Hunting), phát hiện tài nguyên/địa điểm/kiến thức/NPC, di chuyển trong thế giới và quay trở về settlement. Ban đêm (Night) tập trung vào: gia tăng hiểm họa sinh vật, phòng thủ căn cứ (Settlement defense), sinh tồn của quần thể dân cư, chuẩn bị căn cứ và quản lý settlement.</w:t>
       </w:r>
     </w:p>
     <w:p>
@@ -3367,47 +3107,7 @@
           <w:szCs w:val="24"/>
           <w:lang w:val="vi-VN" w:eastAsia="vi-VN"/>
         </w:rPr>
-        <w:t xml:space="preserve">Không tồn tại </w:t>
-      </w:r>
-      <w:proofErr w:type="spellStart"/>
-      <w:r>
-        <w:rPr>
-          <w:rFonts w:ascii="Times New Roman" w:hAnsi="Times New Roman" w:cs="Times New Roman"/>
-          <w:sz w:val="24"/>
-          <w:szCs w:val="24"/>
-          <w:lang w:val="vi-VN" w:eastAsia="vi-VN"/>
-        </w:rPr>
-        <w:t>timer</w:t>
-      </w:r>
-      <w:proofErr w:type="spellEnd"/>
-      <w:r>
-        <w:rPr>
-          <w:rFonts w:ascii="Times New Roman" w:hAnsi="Times New Roman" w:cs="Times New Roman"/>
-          <w:sz w:val="24"/>
-          <w:szCs w:val="24"/>
-          <w:lang w:val="vi-VN" w:eastAsia="vi-VN"/>
-        </w:rPr>
-        <w:t xml:space="preserve"> cưỡng chế người chơi trở về </w:t>
-      </w:r>
-      <w:proofErr w:type="spellStart"/>
-      <w:r>
-        <w:rPr>
-          <w:rFonts w:ascii="Times New Roman" w:hAnsi="Times New Roman" w:cs="Times New Roman"/>
-          <w:sz w:val="24"/>
-          <w:szCs w:val="24"/>
-          <w:lang w:val="vi-VN" w:eastAsia="vi-VN"/>
-        </w:rPr>
-        <w:t>Settlement</w:t>
-      </w:r>
-      <w:proofErr w:type="spellEnd"/>
-      <w:r>
-        <w:rPr>
-          <w:rFonts w:ascii="Times New Roman" w:hAnsi="Times New Roman" w:cs="Times New Roman"/>
-          <w:sz w:val="24"/>
-          <w:szCs w:val="24"/>
-          <w:lang w:val="vi-VN" w:eastAsia="vi-VN"/>
-        </w:rPr>
-        <w:t>.</w:t>
+        <w:t>Không tồn tại timer cưỡng chế người chơi trở về Settlement, và không có cơ chế rút lui tức thì hay extraction point. Người chơi phải di chuyển vật lý qua thế giới và tự di chuyển vật lý quay trở về settlement.</w:t>
       </w:r>
     </w:p>
     <w:p>
@@ -4156,45 +3856,14 @@
           <w:lang w:val="vi-VN" w:eastAsia="vi-VN"/>
         </w:rPr>
       </w:pPr>
-      <w:proofErr w:type="spellStart"/>
-      <w:r>
-        <w:rPr>
-          <w:rFonts w:ascii="Times New Roman" w:hAnsi="Times New Roman" w:cs="Times New Roman"/>
-          <w:sz w:val="24"/>
-          <w:szCs w:val="24"/>
-          <w:lang w:val="vi-VN" w:eastAsia="vi-VN"/>
-        </w:rPr>
-        <w:t>Settlement</w:t>
-      </w:r>
-      <w:proofErr w:type="spellEnd"/>
-      <w:r>
-        <w:rPr>
-          <w:rFonts w:ascii="Times New Roman" w:hAnsi="Times New Roman" w:cs="Times New Roman"/>
-          <w:sz w:val="24"/>
-          <w:szCs w:val="24"/>
-          <w:lang w:val="vi-VN" w:eastAsia="vi-VN"/>
-        </w:rPr>
-        <w:t xml:space="preserve"> là hệ thống </w:t>
-      </w:r>
-      <w:proofErr w:type="spellStart"/>
-      <w:r>
-        <w:rPr>
-          <w:rFonts w:ascii="Times New Roman" w:hAnsi="Times New Roman" w:cs="Times New Roman"/>
-          <w:sz w:val="24"/>
-          <w:szCs w:val="24"/>
-          <w:lang w:val="vi-VN" w:eastAsia="vi-VN"/>
-        </w:rPr>
-        <w:t>progression</w:t>
-      </w:r>
-      <w:proofErr w:type="spellEnd"/>
-      <w:r>
-        <w:rPr>
-          <w:rFonts w:ascii="Times New Roman" w:hAnsi="Times New Roman" w:cs="Times New Roman"/>
-          <w:sz w:val="24"/>
-          <w:szCs w:val="24"/>
-          <w:lang w:val="vi-VN" w:eastAsia="vi-VN"/>
-        </w:rPr>
-        <w:t xml:space="preserve"> trung tâm.</w:t>
+      <w:r>
+        <w:rPr>
+          <w:rFonts w:ascii="Times New Roman" w:hAnsi="Times New Roman" w:cs="Times New Roman"/>
+          <w:sz w:val="24"/>
+          <w:szCs w:val="24"/>
+          <w:lang w:val="vi-VN" w:eastAsia="vi-VN"/>
+        </w:rPr>
+        <w:t>Settlement là căn cứ/nhà của người chơi và là một cộng đồng chức năng hoàn chỉnh bao gồm: Common population, Key NPCs, công trình, sản xuất, chế tạo, quản lý tài nguyên, phòng thủ và progression. Người chơi có thể lựa chọn địa điểm phù hợp trong thế giới để thiết lập settlement; vị trí được chọn ảnh hưởng đến tiếp cận tài nguyên, hiểm họa sinh vật, mối đe dọa ban đêm, rủi ro môi trường, tính kết nối giao thông, lợi thế phòng thủ và khoảng cách đến các khu vực khám phá.</w:t>
       </w:r>
     </w:p>
     <w:p>
@@ -4396,107 +4065,7 @@
           <w:szCs w:val="24"/>
           <w:lang w:val="vi-VN" w:eastAsia="vi-VN"/>
         </w:rPr>
-        <w:t xml:space="preserve">NPC có Stats, Talents, </w:t>
-      </w:r>
-      <w:proofErr w:type="spellStart"/>
-      <w:r>
-        <w:rPr>
-          <w:rFonts w:ascii="Times New Roman" w:hAnsi="Times New Roman" w:cs="Times New Roman"/>
-          <w:sz w:val="24"/>
-          <w:szCs w:val="24"/>
-          <w:lang w:val="vi-VN" w:eastAsia="vi-VN"/>
-        </w:rPr>
-        <w:t>Traits</w:t>
-      </w:r>
-      <w:proofErr w:type="spellEnd"/>
-      <w:r>
-        <w:rPr>
-          <w:rFonts w:ascii="Times New Roman" w:hAnsi="Times New Roman" w:cs="Times New Roman"/>
-          <w:sz w:val="24"/>
-          <w:szCs w:val="24"/>
-          <w:lang w:val="vi-VN" w:eastAsia="vi-VN"/>
-        </w:rPr>
-        <w:t xml:space="preserve">, </w:t>
-      </w:r>
-      <w:proofErr w:type="spellStart"/>
-      <w:r>
-        <w:rPr>
-          <w:rFonts w:ascii="Times New Roman" w:hAnsi="Times New Roman" w:cs="Times New Roman"/>
-          <w:sz w:val="24"/>
-          <w:szCs w:val="24"/>
-          <w:lang w:val="vi-VN" w:eastAsia="vi-VN"/>
-        </w:rPr>
-        <w:t>Profession</w:t>
-      </w:r>
-      <w:proofErr w:type="spellEnd"/>
-      <w:r>
-        <w:rPr>
-          <w:rFonts w:ascii="Times New Roman" w:hAnsi="Times New Roman" w:cs="Times New Roman"/>
-          <w:sz w:val="24"/>
-          <w:szCs w:val="24"/>
-          <w:lang w:val="vi-VN" w:eastAsia="vi-VN"/>
-        </w:rPr>
-        <w:t xml:space="preserve">, </w:t>
-      </w:r>
-      <w:proofErr w:type="spellStart"/>
-      <w:r>
-        <w:rPr>
-          <w:rFonts w:ascii="Times New Roman" w:hAnsi="Times New Roman" w:cs="Times New Roman"/>
-          <w:sz w:val="24"/>
-          <w:szCs w:val="24"/>
-          <w:lang w:val="vi-VN" w:eastAsia="vi-VN"/>
-        </w:rPr>
-        <w:t>Relationship</w:t>
-      </w:r>
-      <w:proofErr w:type="spellEnd"/>
-      <w:r>
-        <w:rPr>
-          <w:rFonts w:ascii="Times New Roman" w:hAnsi="Times New Roman" w:cs="Times New Roman"/>
-          <w:sz w:val="24"/>
-          <w:szCs w:val="24"/>
-          <w:lang w:val="vi-VN" w:eastAsia="vi-VN"/>
-        </w:rPr>
-        <w:t xml:space="preserve"> và </w:t>
-      </w:r>
-      <w:proofErr w:type="spellStart"/>
-      <w:r>
-        <w:rPr>
-          <w:rFonts w:ascii="Times New Roman" w:hAnsi="Times New Roman" w:cs="Times New Roman"/>
-          <w:sz w:val="24"/>
-          <w:szCs w:val="24"/>
-          <w:lang w:val="vi-VN" w:eastAsia="vi-VN"/>
-        </w:rPr>
-        <w:t>Personal</w:t>
-      </w:r>
-      <w:proofErr w:type="spellEnd"/>
-      <w:r>
-        <w:rPr>
-          <w:rFonts w:ascii="Times New Roman" w:hAnsi="Times New Roman" w:cs="Times New Roman"/>
-          <w:sz w:val="24"/>
-          <w:szCs w:val="24"/>
-          <w:lang w:val="vi-VN" w:eastAsia="vi-VN"/>
-        </w:rPr>
-        <w:t xml:space="preserve"> </w:t>
-      </w:r>
-      <w:proofErr w:type="spellStart"/>
-      <w:r>
-        <w:rPr>
-          <w:rFonts w:ascii="Times New Roman" w:hAnsi="Times New Roman" w:cs="Times New Roman"/>
-          <w:sz w:val="24"/>
-          <w:szCs w:val="24"/>
-          <w:lang w:val="vi-VN" w:eastAsia="vi-VN"/>
-        </w:rPr>
-        <w:t>History</w:t>
-      </w:r>
-      <w:proofErr w:type="spellEnd"/>
-      <w:r>
-        <w:rPr>
-          <w:rFonts w:ascii="Times New Roman" w:hAnsi="Times New Roman" w:cs="Times New Roman"/>
-          <w:sz w:val="24"/>
-          <w:szCs w:val="24"/>
-          <w:lang w:val="vi-VN" w:eastAsia="vi-VN"/>
-        </w:rPr>
-        <w:t xml:space="preserve"> riêng.</w:t>
+        <w:t>NPC trong thế giới được phân thành hai nhóm rõ rệt: Common NPCs và Key NPCs. Common NPCs đại diện cho quần thể dân cư thông thường trong settlement (ví dụ: Farmer, Guard, Hunter, Gatherer, Miner, Builder, Scout, Hauler, Worker), sử dụng tên tạo ngẫu nhiên, đảm nhận vai trò mô phỏng đơn giản, có thể chuyển đổi công việc hoặc thay thế khi cần và không yêu cầu questline lớn riêng lẻ. Key NPCs là các nhân vật độc nhất có tên cố định (ví dụ: Blacksmith, Engineer, Scholar, Alchemist, Merchant), giữ vai trò chuyên gia quan trọng và gắn liền với các hệ thống gameplay/progression cốt lõi.</w:t>
       </w:r>
     </w:p>
     <w:p>
@@ -5510,7 +5079,6 @@
           <w:lang w:val="vi-VN" w:eastAsia="vi-VN"/>
         </w:rPr>
       </w:pPr>
-      <w:proofErr w:type="spellStart"/>
       <w:r>
         <w:rPr>
           <w:rFonts w:ascii="Times New Roman" w:hAnsi="Times New Roman" w:cs="Times New Roman"/>
@@ -5520,763 +5088,7 @@
           <w:szCs w:val="24"/>
           <w:lang w:val="vi-VN" w:eastAsia="vi-VN"/>
         </w:rPr>
-        <w:t>Prepare</w:t>
-      </w:r>
-      <w:proofErr w:type="spellEnd"/>
-      <w:r>
-        <w:rPr>
-          <w:rFonts w:ascii="Times New Roman" w:hAnsi="Times New Roman" w:cs="Times New Roman"/>
-          <w:b/>
-          <w:bCs/>
-          <w:sz w:val="24"/>
-          <w:szCs w:val="24"/>
-          <w:lang w:val="vi-VN" w:eastAsia="vi-VN"/>
-        </w:rPr>
-        <w:t xml:space="preserve"> </w:t>
-      </w:r>
-      <w:proofErr w:type="spellStart"/>
-      <w:r>
-        <w:rPr>
-          <w:rFonts w:ascii="Times New Roman" w:hAnsi="Times New Roman" w:cs="Times New Roman"/>
-          <w:b/>
-          <w:bCs/>
-          <w:sz w:val="24"/>
-          <w:szCs w:val="24"/>
-          <w:lang w:val="vi-VN" w:eastAsia="vi-VN"/>
-        </w:rPr>
-        <w:t>Settlement</w:t>
-      </w:r>
-      <w:proofErr w:type="spellEnd"/>
-      <w:r>
-        <w:rPr>
-          <w:rFonts w:ascii="Times New Roman" w:hAnsi="Times New Roman" w:cs="Times New Roman"/>
-          <w:b/>
-          <w:bCs/>
-          <w:sz w:val="24"/>
-          <w:szCs w:val="24"/>
-          <w:lang w:val="vi-VN" w:eastAsia="vi-VN"/>
-        </w:rPr>
-        <w:t xml:space="preserve"> → </w:t>
-      </w:r>
-      <w:proofErr w:type="spellStart"/>
-      <w:r>
-        <w:rPr>
-          <w:rFonts w:ascii="Times New Roman" w:hAnsi="Times New Roman" w:cs="Times New Roman"/>
-          <w:b/>
-          <w:bCs/>
-          <w:sz w:val="24"/>
-          <w:szCs w:val="24"/>
-          <w:lang w:val="vi-VN" w:eastAsia="vi-VN"/>
-        </w:rPr>
-        <w:t>Gather</w:t>
-      </w:r>
-      <w:proofErr w:type="spellEnd"/>
-      <w:r>
-        <w:rPr>
-          <w:rFonts w:ascii="Times New Roman" w:hAnsi="Times New Roman" w:cs="Times New Roman"/>
-          <w:b/>
-          <w:bCs/>
-          <w:sz w:val="24"/>
-          <w:szCs w:val="24"/>
-          <w:lang w:val="vi-VN" w:eastAsia="vi-VN"/>
-        </w:rPr>
-        <w:t xml:space="preserve"> </w:t>
-      </w:r>
-      <w:proofErr w:type="spellStart"/>
-      <w:r>
-        <w:rPr>
-          <w:rFonts w:ascii="Times New Roman" w:hAnsi="Times New Roman" w:cs="Times New Roman"/>
-          <w:b/>
-          <w:bCs/>
-          <w:sz w:val="24"/>
-          <w:szCs w:val="24"/>
-          <w:lang w:val="vi-VN" w:eastAsia="vi-VN"/>
-        </w:rPr>
-        <w:t>Intelligence</w:t>
-      </w:r>
-      <w:proofErr w:type="spellEnd"/>
-      <w:r>
-        <w:rPr>
-          <w:rFonts w:ascii="Times New Roman" w:hAnsi="Times New Roman" w:cs="Times New Roman"/>
-          <w:b/>
-          <w:bCs/>
-          <w:sz w:val="24"/>
-          <w:szCs w:val="24"/>
-          <w:lang w:val="vi-VN" w:eastAsia="vi-VN"/>
-        </w:rPr>
-        <w:t xml:space="preserve"> → </w:t>
-      </w:r>
-      <w:proofErr w:type="spellStart"/>
-      <w:r>
-        <w:rPr>
-          <w:rFonts w:ascii="Times New Roman" w:hAnsi="Times New Roman" w:cs="Times New Roman"/>
-          <w:b/>
-          <w:bCs/>
-          <w:sz w:val="24"/>
-          <w:szCs w:val="24"/>
-          <w:lang w:val="vi-VN" w:eastAsia="vi-VN"/>
-        </w:rPr>
-        <w:t>Select</w:t>
-      </w:r>
-      <w:proofErr w:type="spellEnd"/>
-      <w:r>
-        <w:rPr>
-          <w:rFonts w:ascii="Times New Roman" w:hAnsi="Times New Roman" w:cs="Times New Roman"/>
-          <w:b/>
-          <w:bCs/>
-          <w:sz w:val="24"/>
-          <w:szCs w:val="24"/>
-          <w:lang w:val="vi-VN" w:eastAsia="vi-VN"/>
-        </w:rPr>
-        <w:t xml:space="preserve"> Map → </w:t>
-      </w:r>
-      <w:proofErr w:type="spellStart"/>
-      <w:r>
-        <w:rPr>
-          <w:rFonts w:ascii="Times New Roman" w:hAnsi="Times New Roman" w:cs="Times New Roman"/>
-          <w:b/>
-          <w:bCs/>
-          <w:sz w:val="24"/>
-          <w:szCs w:val="24"/>
-          <w:lang w:val="vi-VN" w:eastAsia="vi-VN"/>
-        </w:rPr>
-        <w:t>Select</w:t>
-      </w:r>
-      <w:proofErr w:type="spellEnd"/>
-      <w:r>
-        <w:rPr>
-          <w:rFonts w:ascii="Times New Roman" w:hAnsi="Times New Roman" w:cs="Times New Roman"/>
-          <w:b/>
-          <w:bCs/>
-          <w:sz w:val="24"/>
-          <w:szCs w:val="24"/>
-          <w:lang w:val="vi-VN" w:eastAsia="vi-VN"/>
-        </w:rPr>
-        <w:t xml:space="preserve"> </w:t>
-      </w:r>
-      <w:proofErr w:type="spellStart"/>
-      <w:r>
-        <w:rPr>
-          <w:rFonts w:ascii="Times New Roman" w:hAnsi="Times New Roman" w:cs="Times New Roman"/>
-          <w:b/>
-          <w:bCs/>
-          <w:sz w:val="24"/>
-          <w:szCs w:val="24"/>
-          <w:lang w:val="vi-VN" w:eastAsia="vi-VN"/>
-        </w:rPr>
-        <w:t>Deployment</w:t>
-      </w:r>
-      <w:proofErr w:type="spellEnd"/>
-      <w:r>
-        <w:rPr>
-          <w:rFonts w:ascii="Times New Roman" w:hAnsi="Times New Roman" w:cs="Times New Roman"/>
-          <w:b/>
-          <w:bCs/>
-          <w:sz w:val="24"/>
-          <w:szCs w:val="24"/>
-          <w:lang w:val="vi-VN" w:eastAsia="vi-VN"/>
-        </w:rPr>
-        <w:t xml:space="preserve"> Point → </w:t>
-      </w:r>
-      <w:proofErr w:type="spellStart"/>
-      <w:r>
-        <w:rPr>
-          <w:rFonts w:ascii="Times New Roman" w:hAnsi="Times New Roman" w:cs="Times New Roman"/>
-          <w:b/>
-          <w:bCs/>
-          <w:sz w:val="24"/>
-          <w:szCs w:val="24"/>
-          <w:lang w:val="vi-VN" w:eastAsia="vi-VN"/>
-        </w:rPr>
-        <w:t>Deploy</w:t>
-      </w:r>
-      <w:proofErr w:type="spellEnd"/>
-      <w:r>
-        <w:rPr>
-          <w:rFonts w:ascii="Times New Roman" w:hAnsi="Times New Roman" w:cs="Times New Roman"/>
-          <w:b/>
-          <w:bCs/>
-          <w:sz w:val="24"/>
-          <w:szCs w:val="24"/>
-          <w:lang w:val="vi-VN" w:eastAsia="vi-VN"/>
-        </w:rPr>
-        <w:t xml:space="preserve"> → </w:t>
-      </w:r>
-      <w:proofErr w:type="spellStart"/>
-      <w:r>
-        <w:rPr>
-          <w:rFonts w:ascii="Times New Roman" w:hAnsi="Times New Roman" w:cs="Times New Roman"/>
-          <w:b/>
-          <w:bCs/>
-          <w:sz w:val="24"/>
-          <w:szCs w:val="24"/>
-          <w:lang w:val="vi-VN" w:eastAsia="vi-VN"/>
-        </w:rPr>
-        <w:t>Explore</w:t>
-      </w:r>
-      <w:proofErr w:type="spellEnd"/>
-      <w:r>
-        <w:rPr>
-          <w:rFonts w:ascii="Times New Roman" w:hAnsi="Times New Roman" w:cs="Times New Roman"/>
-          <w:b/>
-          <w:bCs/>
-          <w:sz w:val="24"/>
-          <w:szCs w:val="24"/>
-          <w:lang w:val="vi-VN" w:eastAsia="vi-VN"/>
-        </w:rPr>
-        <w:t xml:space="preserve"> / Hunt / </w:t>
-      </w:r>
-      <w:proofErr w:type="spellStart"/>
-      <w:r>
-        <w:rPr>
-          <w:rFonts w:ascii="Times New Roman" w:hAnsi="Times New Roman" w:cs="Times New Roman"/>
-          <w:b/>
-          <w:bCs/>
-          <w:sz w:val="24"/>
-          <w:szCs w:val="24"/>
-          <w:lang w:val="vi-VN" w:eastAsia="vi-VN"/>
-        </w:rPr>
-        <w:t>Loot</w:t>
-      </w:r>
-      <w:proofErr w:type="spellEnd"/>
-      <w:r>
-        <w:rPr>
-          <w:rFonts w:ascii="Times New Roman" w:hAnsi="Times New Roman" w:cs="Times New Roman"/>
-          <w:b/>
-          <w:bCs/>
-          <w:sz w:val="24"/>
-          <w:szCs w:val="24"/>
-          <w:lang w:val="vi-VN" w:eastAsia="vi-VN"/>
-        </w:rPr>
-        <w:t xml:space="preserve"> / </w:t>
-      </w:r>
-      <w:proofErr w:type="spellStart"/>
-      <w:r>
-        <w:rPr>
-          <w:rFonts w:ascii="Times New Roman" w:hAnsi="Times New Roman" w:cs="Times New Roman"/>
-          <w:b/>
-          <w:bCs/>
-          <w:sz w:val="24"/>
-          <w:szCs w:val="24"/>
-          <w:lang w:val="vi-VN" w:eastAsia="vi-VN"/>
-        </w:rPr>
-        <w:t>Negotiate</w:t>
-      </w:r>
-      <w:proofErr w:type="spellEnd"/>
-      <w:r>
-        <w:rPr>
-          <w:rFonts w:ascii="Times New Roman" w:hAnsi="Times New Roman" w:cs="Times New Roman"/>
-          <w:b/>
-          <w:bCs/>
-          <w:sz w:val="24"/>
-          <w:szCs w:val="24"/>
-          <w:lang w:val="vi-VN" w:eastAsia="vi-VN"/>
-        </w:rPr>
-        <w:t xml:space="preserve"> / </w:t>
-      </w:r>
-      <w:proofErr w:type="spellStart"/>
-      <w:r>
-        <w:rPr>
-          <w:rFonts w:ascii="Times New Roman" w:hAnsi="Times New Roman" w:cs="Times New Roman"/>
-          <w:b/>
-          <w:bCs/>
-          <w:sz w:val="24"/>
-          <w:szCs w:val="24"/>
-          <w:lang w:val="vi-VN" w:eastAsia="vi-VN"/>
-        </w:rPr>
-        <w:t>Intervene</w:t>
-      </w:r>
-      <w:proofErr w:type="spellEnd"/>
-      <w:r>
-        <w:rPr>
-          <w:rFonts w:ascii="Times New Roman" w:hAnsi="Times New Roman" w:cs="Times New Roman"/>
-          <w:b/>
-          <w:bCs/>
-          <w:sz w:val="24"/>
-          <w:szCs w:val="24"/>
-          <w:lang w:val="vi-VN" w:eastAsia="vi-VN"/>
-        </w:rPr>
-        <w:t xml:space="preserve"> → World Time </w:t>
-      </w:r>
-      <w:proofErr w:type="spellStart"/>
-      <w:r>
-        <w:rPr>
-          <w:rFonts w:ascii="Times New Roman" w:hAnsi="Times New Roman" w:cs="Times New Roman"/>
-          <w:b/>
-          <w:bCs/>
-          <w:sz w:val="24"/>
-          <w:szCs w:val="24"/>
-          <w:lang w:val="vi-VN" w:eastAsia="vi-VN"/>
-        </w:rPr>
-        <w:t>Progresses</w:t>
-      </w:r>
-      <w:proofErr w:type="spellEnd"/>
-      <w:r>
-        <w:rPr>
-          <w:rFonts w:ascii="Times New Roman" w:hAnsi="Times New Roman" w:cs="Times New Roman"/>
-          <w:b/>
-          <w:bCs/>
-          <w:sz w:val="24"/>
-          <w:szCs w:val="24"/>
-          <w:lang w:val="vi-VN" w:eastAsia="vi-VN"/>
-        </w:rPr>
-        <w:t xml:space="preserve"> → </w:t>
-      </w:r>
-      <w:proofErr w:type="spellStart"/>
-      <w:r>
-        <w:rPr>
-          <w:rFonts w:ascii="Times New Roman" w:hAnsi="Times New Roman" w:cs="Times New Roman"/>
-          <w:b/>
-          <w:bCs/>
-          <w:sz w:val="24"/>
-          <w:szCs w:val="24"/>
-          <w:lang w:val="vi-VN" w:eastAsia="vi-VN"/>
-        </w:rPr>
-        <w:t>Manage</w:t>
-      </w:r>
-      <w:proofErr w:type="spellEnd"/>
-      <w:r>
-        <w:rPr>
-          <w:rFonts w:ascii="Times New Roman" w:hAnsi="Times New Roman" w:cs="Times New Roman"/>
-          <w:b/>
-          <w:bCs/>
-          <w:sz w:val="24"/>
-          <w:szCs w:val="24"/>
-          <w:lang w:val="vi-VN" w:eastAsia="vi-VN"/>
-        </w:rPr>
-        <w:t xml:space="preserve"> </w:t>
-      </w:r>
-      <w:proofErr w:type="spellStart"/>
-      <w:r>
-        <w:rPr>
-          <w:rFonts w:ascii="Times New Roman" w:hAnsi="Times New Roman" w:cs="Times New Roman"/>
-          <w:b/>
-          <w:bCs/>
-          <w:sz w:val="24"/>
-          <w:szCs w:val="24"/>
-          <w:lang w:val="vi-VN" w:eastAsia="vi-VN"/>
-        </w:rPr>
-        <w:t>Supplies</w:t>
-      </w:r>
-      <w:proofErr w:type="spellEnd"/>
-      <w:r>
-        <w:rPr>
-          <w:rFonts w:ascii="Times New Roman" w:hAnsi="Times New Roman" w:cs="Times New Roman"/>
-          <w:b/>
-          <w:bCs/>
-          <w:sz w:val="24"/>
-          <w:szCs w:val="24"/>
-          <w:lang w:val="vi-VN" w:eastAsia="vi-VN"/>
-        </w:rPr>
-        <w:t xml:space="preserve"> / </w:t>
-      </w:r>
-      <w:proofErr w:type="spellStart"/>
-      <w:r>
-        <w:rPr>
-          <w:rFonts w:ascii="Times New Roman" w:hAnsi="Times New Roman" w:cs="Times New Roman"/>
-          <w:b/>
-          <w:bCs/>
-          <w:sz w:val="24"/>
-          <w:szCs w:val="24"/>
-          <w:lang w:val="vi-VN" w:eastAsia="vi-VN"/>
-        </w:rPr>
-        <w:t>Companions</w:t>
-      </w:r>
-      <w:proofErr w:type="spellEnd"/>
-      <w:r>
-        <w:rPr>
-          <w:rFonts w:ascii="Times New Roman" w:hAnsi="Times New Roman" w:cs="Times New Roman"/>
-          <w:b/>
-          <w:bCs/>
-          <w:sz w:val="24"/>
-          <w:szCs w:val="24"/>
-          <w:lang w:val="vi-VN" w:eastAsia="vi-VN"/>
-        </w:rPr>
-        <w:t xml:space="preserve"> / </w:t>
-      </w:r>
-      <w:proofErr w:type="spellStart"/>
-      <w:r>
-        <w:rPr>
-          <w:rFonts w:ascii="Times New Roman" w:hAnsi="Times New Roman" w:cs="Times New Roman"/>
-          <w:b/>
-          <w:bCs/>
-          <w:sz w:val="24"/>
-          <w:szCs w:val="24"/>
-          <w:lang w:val="vi-VN" w:eastAsia="vi-VN"/>
-        </w:rPr>
-        <w:t>Exposure</w:t>
-      </w:r>
-      <w:proofErr w:type="spellEnd"/>
-      <w:r>
-        <w:rPr>
-          <w:rFonts w:ascii="Times New Roman" w:hAnsi="Times New Roman" w:cs="Times New Roman"/>
-          <w:b/>
-          <w:bCs/>
-          <w:sz w:val="24"/>
-          <w:szCs w:val="24"/>
-          <w:lang w:val="vi-VN" w:eastAsia="vi-VN"/>
-        </w:rPr>
-        <w:t xml:space="preserve"> → </w:t>
-      </w:r>
-      <w:proofErr w:type="spellStart"/>
-      <w:r>
-        <w:rPr>
-          <w:rFonts w:ascii="Times New Roman" w:hAnsi="Times New Roman" w:cs="Times New Roman"/>
-          <w:b/>
-          <w:bCs/>
-          <w:sz w:val="24"/>
-          <w:szCs w:val="24"/>
-          <w:lang w:val="vi-VN" w:eastAsia="vi-VN"/>
-        </w:rPr>
-        <w:t>Respond</w:t>
-      </w:r>
-      <w:proofErr w:type="spellEnd"/>
-      <w:r>
-        <w:rPr>
-          <w:rFonts w:ascii="Times New Roman" w:hAnsi="Times New Roman" w:cs="Times New Roman"/>
-          <w:b/>
-          <w:bCs/>
-          <w:sz w:val="24"/>
-          <w:szCs w:val="24"/>
-          <w:lang w:val="vi-VN" w:eastAsia="vi-VN"/>
-        </w:rPr>
-        <w:t xml:space="preserve"> to Dynamic Events → </w:t>
-      </w:r>
-      <w:proofErr w:type="spellStart"/>
-      <w:r>
-        <w:rPr>
-          <w:rFonts w:ascii="Times New Roman" w:hAnsi="Times New Roman" w:cs="Times New Roman"/>
-          <w:b/>
-          <w:bCs/>
-          <w:sz w:val="24"/>
-          <w:szCs w:val="24"/>
-          <w:lang w:val="vi-VN" w:eastAsia="vi-VN"/>
-        </w:rPr>
-        <w:t>Decide</w:t>
-      </w:r>
-      <w:proofErr w:type="spellEnd"/>
-      <w:r>
-        <w:rPr>
-          <w:rFonts w:ascii="Times New Roman" w:hAnsi="Times New Roman" w:cs="Times New Roman"/>
-          <w:b/>
-          <w:bCs/>
-          <w:sz w:val="24"/>
-          <w:szCs w:val="24"/>
-          <w:lang w:val="vi-VN" w:eastAsia="vi-VN"/>
-        </w:rPr>
-        <w:t xml:space="preserve"> </w:t>
-      </w:r>
-      <w:proofErr w:type="spellStart"/>
-      <w:r>
-        <w:rPr>
-          <w:rFonts w:ascii="Times New Roman" w:hAnsi="Times New Roman" w:cs="Times New Roman"/>
-          <w:b/>
-          <w:bCs/>
-          <w:sz w:val="24"/>
-          <w:szCs w:val="24"/>
-          <w:lang w:val="vi-VN" w:eastAsia="vi-VN"/>
-        </w:rPr>
-        <w:t>Whether</w:t>
-      </w:r>
-      <w:proofErr w:type="spellEnd"/>
-      <w:r>
-        <w:rPr>
-          <w:rFonts w:ascii="Times New Roman" w:hAnsi="Times New Roman" w:cs="Times New Roman"/>
-          <w:b/>
-          <w:bCs/>
-          <w:sz w:val="24"/>
-          <w:szCs w:val="24"/>
-          <w:lang w:val="vi-VN" w:eastAsia="vi-VN"/>
-        </w:rPr>
-        <w:t xml:space="preserve"> to </w:t>
-      </w:r>
-      <w:proofErr w:type="spellStart"/>
-      <w:r>
-        <w:rPr>
-          <w:rFonts w:ascii="Times New Roman" w:hAnsi="Times New Roman" w:cs="Times New Roman"/>
-          <w:b/>
-          <w:bCs/>
-          <w:sz w:val="24"/>
-          <w:szCs w:val="24"/>
-          <w:lang w:val="vi-VN" w:eastAsia="vi-VN"/>
-        </w:rPr>
-        <w:t>Stay</w:t>
-      </w:r>
-      <w:proofErr w:type="spellEnd"/>
-      <w:r>
-        <w:rPr>
-          <w:rFonts w:ascii="Times New Roman" w:hAnsi="Times New Roman" w:cs="Times New Roman"/>
-          <w:b/>
-          <w:bCs/>
-          <w:sz w:val="24"/>
-          <w:szCs w:val="24"/>
-          <w:lang w:val="vi-VN" w:eastAsia="vi-VN"/>
-        </w:rPr>
-        <w:t xml:space="preserve"> or Return → </w:t>
-      </w:r>
-      <w:proofErr w:type="spellStart"/>
-      <w:r>
-        <w:rPr>
-          <w:rFonts w:ascii="Times New Roman" w:hAnsi="Times New Roman" w:cs="Times New Roman"/>
-          <w:b/>
-          <w:bCs/>
-          <w:sz w:val="24"/>
-          <w:szCs w:val="24"/>
-          <w:lang w:val="vi-VN" w:eastAsia="vi-VN"/>
-        </w:rPr>
-        <w:t>Reach</w:t>
-      </w:r>
-      <w:proofErr w:type="spellEnd"/>
-      <w:r>
-        <w:rPr>
-          <w:rFonts w:ascii="Times New Roman" w:hAnsi="Times New Roman" w:cs="Times New Roman"/>
-          <w:b/>
-          <w:bCs/>
-          <w:sz w:val="24"/>
-          <w:szCs w:val="24"/>
-          <w:lang w:val="vi-VN" w:eastAsia="vi-VN"/>
-        </w:rPr>
-        <w:t xml:space="preserve"> Return Point → Return to </w:t>
-      </w:r>
-      <w:proofErr w:type="spellStart"/>
-      <w:r>
-        <w:rPr>
-          <w:rFonts w:ascii="Times New Roman" w:hAnsi="Times New Roman" w:cs="Times New Roman"/>
-          <w:b/>
-          <w:bCs/>
-          <w:sz w:val="24"/>
-          <w:szCs w:val="24"/>
-          <w:lang w:val="vi-VN" w:eastAsia="vi-VN"/>
-        </w:rPr>
-        <w:t>Settlement</w:t>
-      </w:r>
-      <w:proofErr w:type="spellEnd"/>
-      <w:r>
-        <w:rPr>
-          <w:rFonts w:ascii="Times New Roman" w:hAnsi="Times New Roman" w:cs="Times New Roman"/>
-          <w:b/>
-          <w:bCs/>
-          <w:sz w:val="24"/>
-          <w:szCs w:val="24"/>
-          <w:lang w:val="vi-VN" w:eastAsia="vi-VN"/>
-        </w:rPr>
-        <w:t xml:space="preserve"> → </w:t>
-      </w:r>
-      <w:proofErr w:type="spellStart"/>
-      <w:r>
-        <w:rPr>
-          <w:rFonts w:ascii="Times New Roman" w:hAnsi="Times New Roman" w:cs="Times New Roman"/>
-          <w:b/>
-          <w:bCs/>
-          <w:sz w:val="24"/>
-          <w:szCs w:val="24"/>
-          <w:lang w:val="vi-VN" w:eastAsia="vi-VN"/>
-        </w:rPr>
-        <w:t>Manage</w:t>
-      </w:r>
-      <w:proofErr w:type="spellEnd"/>
-      <w:r>
-        <w:rPr>
-          <w:rFonts w:ascii="Times New Roman" w:hAnsi="Times New Roman" w:cs="Times New Roman"/>
-          <w:b/>
-          <w:bCs/>
-          <w:sz w:val="24"/>
-          <w:szCs w:val="24"/>
-          <w:lang w:val="vi-VN" w:eastAsia="vi-VN"/>
-        </w:rPr>
-        <w:t xml:space="preserve"> </w:t>
-      </w:r>
-      <w:proofErr w:type="spellStart"/>
-      <w:r>
-        <w:rPr>
-          <w:rFonts w:ascii="Times New Roman" w:hAnsi="Times New Roman" w:cs="Times New Roman"/>
-          <w:b/>
-          <w:bCs/>
-          <w:sz w:val="24"/>
-          <w:szCs w:val="24"/>
-          <w:lang w:val="vi-VN" w:eastAsia="vi-VN"/>
-        </w:rPr>
-        <w:t>Consequences</w:t>
-      </w:r>
-      <w:proofErr w:type="spellEnd"/>
-      <w:r>
-        <w:rPr>
-          <w:rFonts w:ascii="Times New Roman" w:hAnsi="Times New Roman" w:cs="Times New Roman"/>
-          <w:b/>
-          <w:bCs/>
-          <w:sz w:val="24"/>
-          <w:szCs w:val="24"/>
-          <w:lang w:val="vi-VN" w:eastAsia="vi-VN"/>
-        </w:rPr>
-        <w:t xml:space="preserve"> → </w:t>
-      </w:r>
-      <w:proofErr w:type="spellStart"/>
-      <w:r>
-        <w:rPr>
-          <w:rFonts w:ascii="Times New Roman" w:hAnsi="Times New Roman" w:cs="Times New Roman"/>
-          <w:b/>
-          <w:bCs/>
-          <w:sz w:val="24"/>
-          <w:szCs w:val="24"/>
-          <w:lang w:val="vi-VN" w:eastAsia="vi-VN"/>
-        </w:rPr>
-        <w:t>Build</w:t>
-      </w:r>
-      <w:proofErr w:type="spellEnd"/>
-      <w:r>
-        <w:rPr>
-          <w:rFonts w:ascii="Times New Roman" w:hAnsi="Times New Roman" w:cs="Times New Roman"/>
-          <w:b/>
-          <w:bCs/>
-          <w:sz w:val="24"/>
-          <w:szCs w:val="24"/>
-          <w:lang w:val="vi-VN" w:eastAsia="vi-VN"/>
-        </w:rPr>
-        <w:t xml:space="preserve"> / </w:t>
-      </w:r>
-      <w:proofErr w:type="spellStart"/>
-      <w:r>
-        <w:rPr>
-          <w:rFonts w:ascii="Times New Roman" w:hAnsi="Times New Roman" w:cs="Times New Roman"/>
-          <w:b/>
-          <w:bCs/>
-          <w:sz w:val="24"/>
-          <w:szCs w:val="24"/>
-          <w:lang w:val="vi-VN" w:eastAsia="vi-VN"/>
-        </w:rPr>
-        <w:t>Recruit</w:t>
-      </w:r>
-      <w:proofErr w:type="spellEnd"/>
-      <w:r>
-        <w:rPr>
-          <w:rFonts w:ascii="Times New Roman" w:hAnsi="Times New Roman" w:cs="Times New Roman"/>
-          <w:b/>
-          <w:bCs/>
-          <w:sz w:val="24"/>
-          <w:szCs w:val="24"/>
-          <w:lang w:val="vi-VN" w:eastAsia="vi-VN"/>
-        </w:rPr>
-        <w:t xml:space="preserve"> / </w:t>
-      </w:r>
-      <w:proofErr w:type="spellStart"/>
-      <w:r>
-        <w:rPr>
-          <w:rFonts w:ascii="Times New Roman" w:hAnsi="Times New Roman" w:cs="Times New Roman"/>
-          <w:b/>
-          <w:bCs/>
-          <w:sz w:val="24"/>
-          <w:szCs w:val="24"/>
-          <w:lang w:val="vi-VN" w:eastAsia="vi-VN"/>
-        </w:rPr>
-        <w:t>Research</w:t>
-      </w:r>
-      <w:proofErr w:type="spellEnd"/>
-      <w:r>
-        <w:rPr>
-          <w:rFonts w:ascii="Times New Roman" w:hAnsi="Times New Roman" w:cs="Times New Roman"/>
-          <w:b/>
-          <w:bCs/>
-          <w:sz w:val="24"/>
-          <w:szCs w:val="24"/>
-          <w:lang w:val="vi-VN" w:eastAsia="vi-VN"/>
-        </w:rPr>
-        <w:t xml:space="preserve"> / </w:t>
-      </w:r>
-      <w:proofErr w:type="spellStart"/>
-      <w:r>
-        <w:rPr>
-          <w:rFonts w:ascii="Times New Roman" w:hAnsi="Times New Roman" w:cs="Times New Roman"/>
-          <w:b/>
-          <w:bCs/>
-          <w:sz w:val="24"/>
-          <w:szCs w:val="24"/>
-          <w:lang w:val="vi-VN" w:eastAsia="vi-VN"/>
-        </w:rPr>
-        <w:t>Diplomacy</w:t>
-      </w:r>
-      <w:proofErr w:type="spellEnd"/>
-      <w:r>
-        <w:rPr>
-          <w:rFonts w:ascii="Times New Roman" w:hAnsi="Times New Roman" w:cs="Times New Roman"/>
-          <w:b/>
-          <w:bCs/>
-          <w:sz w:val="24"/>
-          <w:szCs w:val="24"/>
-          <w:lang w:val="vi-VN" w:eastAsia="vi-VN"/>
-        </w:rPr>
-        <w:t xml:space="preserve"> / </w:t>
-      </w:r>
-      <w:proofErr w:type="spellStart"/>
-      <w:r>
-        <w:rPr>
-          <w:rFonts w:ascii="Times New Roman" w:hAnsi="Times New Roman" w:cs="Times New Roman"/>
-          <w:b/>
-          <w:bCs/>
-          <w:sz w:val="24"/>
-          <w:szCs w:val="24"/>
-          <w:lang w:val="vi-VN" w:eastAsia="vi-VN"/>
-        </w:rPr>
-        <w:t>Defense</w:t>
-      </w:r>
-      <w:proofErr w:type="spellEnd"/>
-      <w:r>
-        <w:rPr>
-          <w:rFonts w:ascii="Times New Roman" w:hAnsi="Times New Roman" w:cs="Times New Roman"/>
-          <w:b/>
-          <w:bCs/>
-          <w:sz w:val="24"/>
-          <w:szCs w:val="24"/>
-          <w:lang w:val="vi-VN" w:eastAsia="vi-VN"/>
-        </w:rPr>
-        <w:t xml:space="preserve"> </w:t>
-      </w:r>
-      <w:proofErr w:type="spellStart"/>
-      <w:r>
-        <w:rPr>
-          <w:rFonts w:ascii="Times New Roman" w:hAnsi="Times New Roman" w:cs="Times New Roman"/>
-          <w:b/>
-          <w:bCs/>
-          <w:sz w:val="24"/>
-          <w:szCs w:val="24"/>
-          <w:lang w:val="vi-VN" w:eastAsia="vi-VN"/>
-        </w:rPr>
-        <w:t>Preparation</w:t>
-      </w:r>
-      <w:proofErr w:type="spellEnd"/>
-      <w:r>
-        <w:rPr>
-          <w:rFonts w:ascii="Times New Roman" w:hAnsi="Times New Roman" w:cs="Times New Roman"/>
-          <w:b/>
-          <w:bCs/>
-          <w:sz w:val="24"/>
-          <w:szCs w:val="24"/>
-          <w:lang w:val="vi-VN" w:eastAsia="vi-VN"/>
-        </w:rPr>
-        <w:t xml:space="preserve"> → </w:t>
-      </w:r>
-      <w:proofErr w:type="spellStart"/>
-      <w:r>
-        <w:rPr>
-          <w:rFonts w:ascii="Times New Roman" w:hAnsi="Times New Roman" w:cs="Times New Roman"/>
-          <w:b/>
-          <w:bCs/>
-          <w:sz w:val="24"/>
-          <w:szCs w:val="24"/>
-          <w:lang w:val="vi-VN" w:eastAsia="vi-VN"/>
-        </w:rPr>
-        <w:t>Repeat</w:t>
-      </w:r>
-      <w:proofErr w:type="spellEnd"/>
-      <w:r>
-        <w:rPr>
-          <w:rFonts w:ascii="Times New Roman" w:hAnsi="Times New Roman" w:cs="Times New Roman"/>
-          <w:b/>
-          <w:bCs/>
-          <w:sz w:val="24"/>
-          <w:szCs w:val="24"/>
-          <w:lang w:val="vi-VN" w:eastAsia="vi-VN"/>
-        </w:rPr>
-        <w:t>.</w:t>
+        <w:t>Prepare Settlement → Gather Intelligence → Select Map → Select Deployment Point → Deploy → Explore / Hunt / Physical Loot Pickup / Negotiate / Intervene → World Time Progresses (Day/Night Cycle) → Manage Supplies / Companions / Exposure → Respond to Dynamic Events &amp; Night Threats → Decide Whether to Stay or Return → Physically Travel Back Through the World → Return to Settlement → Manage Consequences → Build / Recruit / Research / Diplomacy / Defense Preparation → Repeat.</w:t>
       </w:r>
     </w:p>
     <w:p>
@@ -6821,65 +5633,14 @@
           <w:lang w:val="vi-VN" w:eastAsia="vi-VN"/>
         </w:rPr>
       </w:pPr>
-      <w:proofErr w:type="spellStart"/>
-      <w:r>
-        <w:rPr>
-          <w:rFonts w:ascii="Times New Roman" w:hAnsi="Times New Roman" w:cs="Times New Roman"/>
-          <w:sz w:val="24"/>
-          <w:szCs w:val="24"/>
-          <w:lang w:val="vi-VN" w:eastAsia="vi-VN"/>
-        </w:rPr>
-        <w:t>Difficulty</w:t>
-      </w:r>
-      <w:proofErr w:type="spellEnd"/>
-      <w:r>
-        <w:rPr>
-          <w:rFonts w:ascii="Times New Roman" w:hAnsi="Times New Roman" w:cs="Times New Roman"/>
-          <w:sz w:val="24"/>
-          <w:szCs w:val="24"/>
-          <w:lang w:val="vi-VN" w:eastAsia="vi-VN"/>
-        </w:rPr>
-        <w:t xml:space="preserve"> không được dựa chủ yếu vào HP/</w:t>
-      </w:r>
-      <w:proofErr w:type="spellStart"/>
-      <w:r>
-        <w:rPr>
-          <w:rFonts w:ascii="Times New Roman" w:hAnsi="Times New Roman" w:cs="Times New Roman"/>
-          <w:sz w:val="24"/>
-          <w:szCs w:val="24"/>
-          <w:lang w:val="vi-VN" w:eastAsia="vi-VN"/>
-        </w:rPr>
-        <w:t>Damage</w:t>
-      </w:r>
-      <w:proofErr w:type="spellEnd"/>
-      <w:r>
-        <w:rPr>
-          <w:rFonts w:ascii="Times New Roman" w:hAnsi="Times New Roman" w:cs="Times New Roman"/>
-          <w:sz w:val="24"/>
-          <w:szCs w:val="24"/>
-          <w:lang w:val="vi-VN" w:eastAsia="vi-VN"/>
-        </w:rPr>
-        <w:t xml:space="preserve"> </w:t>
-      </w:r>
-      <w:proofErr w:type="spellStart"/>
-      <w:r>
-        <w:rPr>
-          <w:rFonts w:ascii="Times New Roman" w:hAnsi="Times New Roman" w:cs="Times New Roman"/>
-          <w:sz w:val="24"/>
-          <w:szCs w:val="24"/>
-          <w:lang w:val="vi-VN" w:eastAsia="vi-VN"/>
-        </w:rPr>
-        <w:t>Scaling</w:t>
-      </w:r>
-      <w:proofErr w:type="spellEnd"/>
-      <w:r>
-        <w:rPr>
-          <w:rFonts w:ascii="Times New Roman" w:hAnsi="Times New Roman" w:cs="Times New Roman"/>
-          <w:sz w:val="24"/>
-          <w:szCs w:val="24"/>
-          <w:lang w:val="vi-VN" w:eastAsia="vi-VN"/>
-        </w:rPr>
-        <w:t>.</w:t>
+      <w:r>
+        <w:rPr>
+          <w:rFonts w:ascii="Times New Roman" w:hAnsi="Times New Roman" w:cs="Times New Roman"/>
+          <w:sz w:val="24"/>
+          <w:szCs w:val="24"/>
+          <w:lang w:val="vi-VN" w:eastAsia="vi-VN"/>
+        </w:rPr>
+        <w:t>Độ khó các khu vực (Regional Difficulty) khác nhau và không được thể hiện đơn thuần qua việc tăng HP/Damage của quái vật. Độ khó khu vực được cấu thành từ mối đe dọa sinh vật, hành vi sinh vật, hiểm họa ban đêm, rủi ro môi trường, địa hình hiểm trở, rủi ro thăm dò, áp lực tài nguyên và các điều kiện đặc thù của từng vùng đất.</w:t>
       </w:r>
     </w:p>
     <w:p>

</xml_diff>